<commit_message>
Set base URL to GitHub Pages address
Co-Authored-By: Claude Opus 5.5 <noreply@anthropic.com>
Claude-Session: https://claude.ai/code/session_01CQxLpwe1Pu1FJJBAM5jt5M
</commit_message>
<xml_diff>
--- a/documents-src/guidelines/cpcf-2027-fall-community-impact-grant-guidelines.docx
+++ b/documents-src/guidelines/cpcf-2027-fall-community-impact-grant-guidelines.docx
@@ -84,7 +84,7 @@
           </w:p>
           <w:p>
             <w:r>
-              <w:t>Program page: https://example.github.io/cinder-peaks-community-foundation/grants/community-impact-grants-fall/</w:t>
+              <w:t>Program page: https://hufsa-stack.github.io/cinder-peaks-community-foundation/grants/community-impact-grants-fall/</w:t>
             </w:r>
           </w:p>
         </w:tc>
@@ -1095,7 +1095,7 @@
         <w:t xml:space="preserve">Community Impact Grant Application Worksheet: </w:t>
       </w:r>
       <w:r>
-        <w:t>https://example.github.io/cinder-peaks-community-foundation/documents/templates/cpcf-community-impact-grant-application-worksheet.pdf</w:t>
+        <w:t>https://hufsa-stack.github.io/cinder-peaks-community-foundation/documents/templates/cpcf-community-impact-grant-application-worksheet.pdf</w:t>
       </w:r>
     </w:p>
     <w:p>
@@ -1109,7 +1109,7 @@
         <w:t xml:space="preserve">Grant Eligibility Checklist: </w:t>
       </w:r>
       <w:r>
-        <w:t>https://example.github.io/cinder-peaks-community-foundation/documents/templates/cpcf-grant-eligibility-checklist.pdf</w:t>
+        <w:t>https://hufsa-stack.github.io/cinder-peaks-community-foundation/documents/templates/cpcf-grant-eligibility-checklist.pdf</w:t>
       </w:r>
     </w:p>
     <w:p>
@@ -1123,7 +1123,7 @@
         <w:t xml:space="preserve">Fiscal Sponsor Letter Template: </w:t>
       </w:r>
       <w:r>
-        <w:t>https://example.github.io/cinder-peaks-community-foundation/documents/templates/cpcf-fiscal-sponsor-letter-template.pdf</w:t>
+        <w:t>https://hufsa-stack.github.io/cinder-peaks-community-foundation/documents/templates/cpcf-fiscal-sponsor-letter-template.pdf</w:t>
       </w:r>
     </w:p>
     <w:p>
@@ -1137,7 +1137,7 @@
         <w:t xml:space="preserve">Community Impact Story Report Form: </w:t>
       </w:r>
       <w:r>
-        <w:t>https://example.github.io/cinder-peaks-community-foundation/documents/reporting/cpcf-community-impact-story-report-form.pdf</w:t>
+        <w:t>https://hufsa-stack.github.io/cinder-peaks-community-foundation/documents/reporting/cpcf-community-impact-story-report-form.pdf</w:t>
       </w:r>
     </w:p>
     <w:p>

</xml_diff>

<commit_message>
Clean preview: deadline time 5:00 p.m. to 6:00 p.m. only
Built directly from the original baseline v1-original (a5b0342). Changes the
grant deadline time on all pages and the 12 documents that state it. Office
hours are unchanged. No other update is included.

Co-Authored-By: Claude Opus 5.5 <noreply@anthropic.com>
Claude-Session: https://claude.ai/code/session_01CQxLpwe1Pu1FJJBAM5jt5M
</commit_message>
<xml_diff>
--- a/documents-src/guidelines/cpcf-2027-fall-community-impact-grant-guidelines.docx
+++ b/documents-src/guidelines/cpcf-2027-fall-community-impact-grant-guidelines.docx
@@ -788,7 +788,7 @@
               <w:rPr>
                 <w:sz w:val="19"/>
               </w:rPr>
-              <w:t>Friday, August 20, 2027, 5:00 p.m. MST</w:t>
+              <w:t>Friday, August 20, 2027, 6:00 p.m. MST</w:t>
             </w:r>
           </w:p>
         </w:tc>
@@ -948,7 +948,7 @@
         <w:t xml:space="preserve">4.  Submit the application. </w:t>
       </w:r>
       <w:r>
-        <w:t>Submit the online application, operating budget, and most recent financial statements by 5:00 p.m. MST on August 20, 2027.</w:t>
+        <w:t>Submit the online application, operating budget, and most recent financial statements by 6:00 p.m. MST on August 20, 2027.</w:t>
       </w:r>
     </w:p>
     <w:p>

</xml_diff>

<commit_message>
Clean preview: History, Arts & Culture focus-area rename only
Built directly from the original baseline v1-original (a5b0342). Renames the
focus-area label everywhere it represents the category, with URLs unchanged.
No other update is included.

Co-Authored-By: Claude Opus 5.5 <noreply@anthropic.com>
Claude-Session: https://claude.ai/code/session_01CQxLpwe1Pu1FJJBAM5jt5M
</commit_message>
<xml_diff>
--- a/documents-src/guidelines/cpcf-2027-fall-community-impact-grant-guidelines.docx
+++ b/documents-src/guidelines/cpcf-2027-fall-community-impact-grant-guidelines.docx
@@ -132,7 +132,7 @@
         <w:rPr>
           <w:i w:val="0"/>
         </w:rPr>
-        <w:t>Focus areas: Education &amp; Youth, Arts &amp; Culture, Environment &amp; Land Stewardship, Animal Welfare.</w:t>
+        <w:t>Focus areas: Education &amp; Youth, History, Arts &amp; Culture, Environment &amp; Land Stewardship, Animal Welfare.</w:t>
       </w:r>
     </w:p>
     <w:p>
@@ -316,7 +316,7 @@
         <w:pStyle w:val="ListBullet"/>
       </w:pPr>
       <w:r>
-        <w:t>Work aligns with at least one Fall Cycle field of interest: Education &amp; Youth, Arts &amp; Culture, Environment &amp; Land Stewardship, or Animal Welfare</w:t>
+        <w:t>Work aligns with at least one Fall Cycle field of interest: Education &amp; Youth, History, Arts &amp; Culture, Environment &amp; Land Stewardship, or Animal Welfare</w:t>
       </w:r>
     </w:p>
     <w:p>

</xml_diff>

<commit_message>
Change 2: Fall Community Impact Grants: application method changed from the online portal to emailing a completed application packet.
Independent test branch created directly from BASELINE v1-original
(a5b0342). Contains this change only.

Co-Authored-By: Claude Opus 5.5 <noreply@anthropic.com>
Claude-Session: https://claude.ai/code/session_01CQxLpwe1Pu1FJJBAM5jt5M
</commit_message>
<xml_diff>
--- a/documents-src/guidelines/cpcf-2027-fall-community-impact-grant-guidelines.docx
+++ b/documents-src/guidelines/cpcf-2027-fall-community-impact-grant-guidelines.docx
@@ -888,7 +888,7 @@
         <w:rPr>
           <w:i w:val="0"/>
         </w:rPr>
-        <w:t>Applications are submitted through the CPCF Grant Portal during the open window. The Fall Cycle uses the same application worksheet as the Spring Cycle.</w:t>
+        <w:t>Applications are submitted by email as a completed application packet during the open window. The CPCF Grant Portal is not used for the Fall Cycle, which uses the same application worksheet as the Spring Cycle.</w:t>
       </w:r>
     </w:p>
     <w:p>
@@ -915,10 +915,10 @@
         <w:rPr>
           <w:b/>
         </w:rPr>
-        <w:t xml:space="preserve">2.  Prepare your answers. </w:t>
+        <w:t xml:space="preserve">2.  Complete the application worksheet. </w:t>
       </w:r>
       <w:r>
-        <w:t>Download the Community Impact Grant Application Worksheet and draft your responses.</w:t>
+        <w:t>Download the Community Impact Grant Application Worksheet and complete every section. The completed worksheet is your application form.</w:t>
       </w:r>
     </w:p>
     <w:p>
@@ -930,10 +930,10 @@
         <w:rPr>
           <w:b/>
         </w:rPr>
-        <w:t xml:space="preserve">3.  Create or update your portal account. </w:t>
+        <w:t xml:space="preserve">3.  Assemble the application packet. </w:t>
       </w:r>
       <w:r>
-        <w:t>New applicants create an organization profile in the CPCF Grant Portal. Returning applicants confirm that their profile is current.</w:t>
+        <w:t>Combine the completed worksheet, current operating budget, and most recent financial statements into a single PDF application packet.</w:t>
       </w:r>
     </w:p>
     <w:p>
@@ -945,10 +945,10 @@
         <w:rPr>
           <w:b/>
         </w:rPr>
-        <w:t xml:space="preserve">4.  Submit the application. </w:t>
+        <w:t xml:space="preserve">4.  Email the application packet. </w:t>
       </w:r>
       <w:r>
-        <w:t>Submit the online application, operating budget, and most recent financial statements by 5:00 p.m. MST on August 20, 2027.</w:t>
+        <w:t>Email the completed application packet to the program officer listed under Contact for this program by 5:00 p.m. MST on August 20, 2027. Use the subject line "Fall Cycle Application – [Organization Name]".</w:t>
       </w:r>
     </w:p>
     <w:p>

</xml_diff>

<commit_message>
Change 10: Fall Community Impact Grants: application deadline changed from August 20, 2027 to August 27, 2027.
Independent test branch created directly from BASELINE v1-original
(a5b0342). Contains this change only.

Co-Authored-By: Claude Opus 5.5 <noreply@anthropic.com>
Claude-Session: https://claude.ai/code/session_01CQxLpwe1Pu1FJJBAM5jt5M
</commit_message>
<xml_diff>
--- a/documents-src/guidelines/cpcf-2027-fall-community-impact-grant-guidelines.docx
+++ b/documents-src/guidelines/cpcf-2027-fall-community-impact-grant-guidelines.docx
@@ -788,7 +788,7 @@
               <w:rPr>
                 <w:sz w:val="19"/>
               </w:rPr>
-              <w:t>Friday, August 20, 2027, 5:00 p.m. MST</w:t>
+              <w:t>Friday, August 27, 2027, 5:00 p.m. MST</w:t>
             </w:r>
           </w:p>
         </w:tc>
@@ -948,7 +948,7 @@
         <w:t xml:space="preserve">4.  Submit the application. </w:t>
       </w:r>
       <w:r>
-        <w:t>Submit the online application, operating budget, and most recent financial statements by 5:00 p.m. MST on August 20, 2027.</w:t>
+        <w:t>Submit the online application, operating budget, and most recent financial statements by 5:00 p.m. MST on August 27, 2027.</w:t>
       </w:r>
     </w:p>
     <w:p>

</xml_diff>

<commit_message>
Change 11: Fall Community Impact Grants: board review meeting on October 28, 2027 added as a separate milestone.
Independent test branch created directly from BASELINE v1-original
(a5b0342). Contains this change only.

Co-Authored-By: Claude Opus 5.5 <noreply@anthropic.com>
Claude-Session: https://claude.ai/code/session_01CQxLpwe1Pu1FJJBAM5jt5M
</commit_message>
<xml_diff>
--- a/documents-src/guidelines/cpcf-2027-fall-community-impact-grant-guidelines.docx
+++ b/documents-src/guidelines/cpcf-2027-fall-community-impact-grant-guidelines.docx
@@ -809,6 +809,44 @@
                 <w:b/>
                 <w:sz w:val="19"/>
               </w:rPr>
+              <w:t>Board review meeting</w:t>
+            </w:r>
+          </w:p>
+        </w:tc>
+        <w:tc>
+          <w:tcPr>
+            <w:tcW w:type="dxa" w:w="6192"/>
+          </w:tcPr>
+          <w:p>
+            <w:pPr>
+              <w:spacing w:after="40"/>
+            </w:pPr>
+            <w:r/>
+            <w:r>
+              <w:rPr>
+                <w:sz w:val="19"/>
+              </w:rPr>
+              <w:t>Thursday, October 28, 2027</w:t>
+            </w:r>
+          </w:p>
+        </w:tc>
+      </w:tr>
+      <w:tr>
+        <w:tc>
+          <w:tcPr>
+            <w:tcW w:type="dxa" w:w="3456"/>
+            <w:shd w:val="clear" w:color="auto" w:fill="F4EEE4"/>
+          </w:tcPr>
+          <w:p>
+            <w:pPr>
+              <w:spacing w:after="40"/>
+            </w:pPr>
+            <w:r/>
+            <w:r>
+              <w:rPr>
+                <w:b/>
+                <w:sz w:val="19"/>
+              </w:rPr>
               <w:t>Decision</w:t>
             </w:r>
           </w:p>

</xml_diff>